<commit_message>
add comparison with analogs in main idea docs
</commit_message>
<xml_diff>
--- a/RestBookingProjDoc/Concept-Idea.docx
+++ b/RestBookingProjDoc/Concept-Idea.docx
@@ -1,159 +1,1508 @@
 
 <file path=word/document.xml><?xml version="1.0" encoding="utf-8"?>
-<w:document xmlns:wpc="http://schemas.microsoft.com/office/word/2010/wordprocessingCanvas" xmlns:cx="http://schemas.microsoft.com/office/drawing/2014/chartex" xmlns:cx1="http://schemas.microsoft.com/office/drawing/2015/9/8/chartex" xmlns:cx2="http://schemas.microsoft.com/office/drawing/2015/10/21/chartex" xmlns:cx3="http://schemas.microsoft.com/office/drawing/2016/5/9/chartex" xmlns:cx4="http://schemas.microsoft.com/office/drawing/2016/5/10/chartex" xmlns:cx5="http://schemas.microsoft.com/office/drawing/2016/5/11/chartex" xmlns:cx6="http://schemas.microsoft.com/office/drawing/2016/5/12/chartex" xmlns:cx7="http://schemas.microsoft.com/office/drawing/2016/5/13/chartex" xmlns:cx8="http://schemas.microsoft.com/office/drawing/2016/5/14/chartex" xmlns:mc="http://schemas.openxmlformats.org/markup-compatibility/2006" xmlns:aink="http://schemas.microsoft.com/office/drawing/2016/ink" xmlns:am3d="http://schemas.microsoft.com/office/drawing/2017/model3d" xmlns:o="urn:schemas-microsoft-com:office:office" xmlns:oel="http://schemas.microsoft.com/office/2019/extlst" xmlns:r="http://schemas.openxmlformats.org/officeDocument/2006/relationships" xmlns:m="http://schemas.openxmlformats.org/officeDocument/2006/math" xmlns:v="urn:schemas-microsoft-com:vml" xmlns:wp14="http://schemas.microsoft.com/office/word/2010/wordprocessingDrawing" xmlns:wp="http://schemas.openxmlformats.org/drawingml/2006/wordprocessingDrawing" xmlns:w10="urn:schemas-microsoft-com:office:word" xmlns:w="http://schemas.openxmlformats.org/wordprocessingml/2006/main" xmlns:w14="http://schemas.microsoft.com/office/word/2010/wordml" xmlns:w15="http://schemas.microsoft.com/office/word/2012/wordml" xmlns:w16cex="http://schemas.microsoft.com/office/word/2018/wordml/cex" xmlns:w16cid="http://schemas.microsoft.com/office/word/2016/wordml/cid" xmlns:w16="http://schemas.microsoft.com/office/word/2018/wordml" xmlns:w16du="http://schemas.microsoft.com/office/word/2023/wordml/word16du" xmlns:w16sdtdh="http://schemas.microsoft.com/office/word/2020/wordml/sdtdatahash" xmlns:w16sdtfl="http://schemas.microsoft.com/office/word/2024/wordml/sdtformatlock" xmlns:w16se="http://schemas.microsoft.com/office/word/2015/wordml/symex" xmlns:wpg="http://schemas.microsoft.com/office/word/2010/wordprocessingGroup" xmlns:wpi="http://schemas.microsoft.com/office/word/2010/wordprocessingInk" xmlns:wne="http://schemas.microsoft.com/office/word/2006/wordml" xmlns:wps="http://schemas.microsoft.com/office/word/2010/wordprocessingShape" mc:Ignorable="w14 w15 w16se w16cid w16 w16cex w16sdtdh w16sdtfl w16du wp14">
+<w:document xmlns:wpc="http://schemas.microsoft.com/office/word/2010/wordprocessingCanvas" xmlns:cx="http://schemas.microsoft.com/office/drawing/2014/chartex" xmlns:cx1="http://schemas.microsoft.com/office/drawing/2015/9/8/chartex" xmlns:cx2="http://schemas.microsoft.com/office/drawing/2015/10/21/chartex" xmlns:cx3="http://schemas.microsoft.com/office/drawing/2016/5/9/chartex" xmlns:cx4="http://schemas.microsoft.com/office/drawing/2016/5/10/chartex" xmlns:cx5="http://schemas.microsoft.com/office/drawing/2016/5/11/chartex" xmlns:cx6="http://schemas.microsoft.com/office/drawing/2016/5/12/chartex" xmlns:cx7="http://schemas.microsoft.com/office/drawing/2016/5/13/chartex" xmlns:cx8="http://schemas.microsoft.com/office/drawing/2016/5/14/chartex" xmlns:mc="http://schemas.openxmlformats.org/markup-compatibility/2006" xmlns:aink="http://schemas.microsoft.com/office/drawing/2016/ink" xmlns:am3d="http://schemas.microsoft.com/office/drawing/2017/model3d" xmlns:o="urn:schemas-microsoft-com:office:office" xmlns:r="http://schemas.openxmlformats.org/officeDocument/2006/relationships" xmlns:m="http://schemas.openxmlformats.org/officeDocument/2006/math" xmlns:v="urn:schemas-microsoft-com:vml" xmlns:wp14="http://schemas.microsoft.com/office/word/2010/wordprocessingDrawing" xmlns:wp="http://schemas.openxmlformats.org/drawingml/2006/wordprocessingDrawing" xmlns:w10="urn:schemas-microsoft-com:office:word" xmlns:w="http://schemas.openxmlformats.org/wordprocessingml/2006/main" xmlns:w14="http://schemas.microsoft.com/office/word/2010/wordml" xmlns:w15="http://schemas.microsoft.com/office/word/2012/wordml" xmlns:w16cex="http://schemas.microsoft.com/office/word/2018/wordml/cex" xmlns:w16cid="http://schemas.microsoft.com/office/word/2016/wordml/cid" xmlns:w16="http://schemas.microsoft.com/office/word/2018/wordml" xmlns:w16sdtdh="http://schemas.microsoft.com/office/word/2020/wordml/sdtdatahash" xmlns:w16se="http://schemas.microsoft.com/office/word/2015/wordml/symex" xmlns:wpg="http://schemas.microsoft.com/office/word/2010/wordprocessingGroup" xmlns:wpi="http://schemas.microsoft.com/office/word/2010/wordprocessingInk" xmlns:wne="http://schemas.microsoft.com/office/word/2006/wordml" xmlns:wps="http://schemas.microsoft.com/office/word/2010/wordprocessingShape" mc:Ignorable="w14 w15 w16se w16cid w16 w16cex w16sdtdh wp14">
   <w:body>
     <w:p>
       <w:pPr>
         <w:jc w:val="center"/>
         <w:rPr>
+          <w:rFonts w:ascii="Times New Roman" w:hAnsi="Times New Roman" w:cs="Times New Roman"/>
           <w:b/>
           <w:bCs/>
-        </w:rPr>
-      </w:pPr>
-      <w:r>
-        <w:rPr>
+          <w:sz w:val="28"/>
+          <w:szCs w:val="28"/>
+        </w:rPr>
+      </w:pPr>
+      <w:r>
+        <w:rPr>
+          <w:rFonts w:ascii="Times New Roman" w:hAnsi="Times New Roman" w:cs="Times New Roman"/>
           <w:b/>
           <w:bCs/>
+          <w:sz w:val="28"/>
+          <w:szCs w:val="28"/>
         </w:rPr>
         <w:t>Концептуальная идея приложения</w:t>
       </w:r>
     </w:p>
     <w:p>
-      <w:r>
+      <w:pPr>
+        <w:spacing w:after="0" w:line="360" w:lineRule="auto"/>
+        <w:ind w:firstLine="709"/>
+        <w:jc w:val="both"/>
+        <w:rPr>
+          <w:rFonts w:ascii="Times New Roman" w:hAnsi="Times New Roman" w:cs="Times New Roman"/>
+          <w:sz w:val="28"/>
+          <w:szCs w:val="28"/>
+        </w:rPr>
+      </w:pPr>
+      <w:r>
+        <w:rPr>
+          <w:rFonts w:ascii="Times New Roman" w:hAnsi="Times New Roman" w:cs="Times New Roman"/>
+          <w:sz w:val="28"/>
+          <w:szCs w:val="28"/>
+        </w:rPr>
         <w:t xml:space="preserve">Приложение </w:t>
       </w:r>
       <w:r>
         <w:rPr>
+          <w:rFonts w:ascii="Times New Roman" w:hAnsi="Times New Roman" w:cs="Times New Roman"/>
+          <w:sz w:val="28"/>
+          <w:szCs w:val="28"/>
           <w:lang w:val="en-US"/>
         </w:rPr>
         <w:t>WheresVibe</w:t>
       </w:r>
       <w:r>
+        <w:rPr>
+          <w:rFonts w:ascii="Times New Roman" w:hAnsi="Times New Roman" w:cs="Times New Roman"/>
+          <w:sz w:val="28"/>
+          <w:szCs w:val="28"/>
+        </w:rPr>
         <w:t xml:space="preserve"> (</w:t>
       </w:r>
       <w:r>
         <w:rPr>
+          <w:rFonts w:ascii="Times New Roman" w:hAnsi="Times New Roman" w:cs="Times New Roman"/>
+          <w:sz w:val="28"/>
+          <w:szCs w:val="28"/>
           <w:lang w:val="en-US"/>
         </w:rPr>
         <w:t>W</w:t>
       </w:r>
       <w:r>
+        <w:rPr>
+          <w:rFonts w:ascii="Times New Roman" w:hAnsi="Times New Roman" w:cs="Times New Roman"/>
+          <w:sz w:val="28"/>
+          <w:szCs w:val="28"/>
+        </w:rPr>
         <w:t>’</w:t>
       </w:r>
       <w:r>
         <w:rPr>
+          <w:rFonts w:ascii="Times New Roman" w:hAnsi="Times New Roman" w:cs="Times New Roman"/>
+          <w:sz w:val="28"/>
+          <w:szCs w:val="28"/>
           <w:lang w:val="en-US"/>
         </w:rPr>
         <w:t>sV</w:t>
       </w:r>
       <w:r>
-        <w:t xml:space="preserve">) – </w:t>
-      </w:r>
-      <w:r>
-        <w:t>это мобильное приложение для бронирования кафе, ресторанов и прочих развлекательных мест по настроению пользователя (при входе пользователь выбирает сегодняшний вайб – «</w:t>
-      </w:r>
-      <w:r>
-        <w:rPr>
+        <w:rPr>
+          <w:rFonts w:ascii="Times New Roman" w:hAnsi="Times New Roman" w:cs="Times New Roman"/>
+          <w:sz w:val="28"/>
+          <w:szCs w:val="28"/>
+        </w:rPr>
+        <w:t>) – это мобильное приложение для бронирования кафе, ресторанов и прочих развлекательных мест по настроению пользователя (при входе пользователь выбирает сегодняшний вайб – «</w:t>
+      </w:r>
+      <w:r>
+        <w:rPr>
+          <w:rFonts w:ascii="Times New Roman" w:hAnsi="Times New Roman" w:cs="Times New Roman"/>
+          <w:sz w:val="28"/>
+          <w:szCs w:val="28"/>
           <w:lang w:val="en-US"/>
         </w:rPr>
         <w:t>Friendly</w:t>
       </w:r>
       <w:r>
+        <w:rPr>
+          <w:rFonts w:ascii="Times New Roman" w:hAnsi="Times New Roman" w:cs="Times New Roman"/>
+          <w:sz w:val="28"/>
+          <w:szCs w:val="28"/>
+        </w:rPr>
         <w:t xml:space="preserve"> </w:t>
       </w:r>
       <w:r>
         <w:rPr>
+          <w:rFonts w:ascii="Times New Roman" w:hAnsi="Times New Roman" w:cs="Times New Roman"/>
+          <w:sz w:val="28"/>
+          <w:szCs w:val="28"/>
           <w:lang w:val="en-US"/>
         </w:rPr>
         <w:t>Vibe</w:t>
       </w:r>
       <w:r>
+        <w:rPr>
+          <w:rFonts w:ascii="Times New Roman" w:hAnsi="Times New Roman" w:cs="Times New Roman"/>
+          <w:sz w:val="28"/>
+          <w:szCs w:val="28"/>
+        </w:rPr>
         <w:t>» или «</w:t>
       </w:r>
       <w:r>
         <w:rPr>
+          <w:rFonts w:ascii="Times New Roman" w:hAnsi="Times New Roman" w:cs="Times New Roman"/>
+          <w:sz w:val="28"/>
+          <w:szCs w:val="28"/>
           <w:lang w:val="en-US"/>
         </w:rPr>
         <w:t>Wild</w:t>
       </w:r>
       <w:r>
+        <w:rPr>
+          <w:rFonts w:ascii="Times New Roman" w:hAnsi="Times New Roman" w:cs="Times New Roman"/>
+          <w:sz w:val="28"/>
+          <w:szCs w:val="28"/>
+        </w:rPr>
         <w:t xml:space="preserve"> </w:t>
       </w:r>
       <w:r>
         <w:rPr>
+          <w:rFonts w:ascii="Times New Roman" w:hAnsi="Times New Roman" w:cs="Times New Roman"/>
+          <w:sz w:val="28"/>
+          <w:szCs w:val="28"/>
           <w:lang w:val="en-US"/>
         </w:rPr>
         <w:t>Romantic</w:t>
       </w:r>
       <w:r>
-        <w:t>»)</w:t>
-      </w:r>
-      <w:r>
-        <w:t xml:space="preserve"> </w:t>
-      </w:r>
-      <w:r>
-        <w:t>–</w:t>
-      </w:r>
-      <w:r>
-        <w:t xml:space="preserve"> </w:t>
-      </w:r>
-      <w:r>
-        <w:t xml:space="preserve">это учитывается в дальнейшем в стиле приложения и в фильтрах при поиске. Данные ресторанов </w:t>
-      </w:r>
-      <w:r>
-        <w:t xml:space="preserve">приходят из </w:t>
-      </w:r>
-      <w:r>
-        <w:rPr>
+        <w:rPr>
+          <w:rFonts w:ascii="Times New Roman" w:hAnsi="Times New Roman" w:cs="Times New Roman"/>
+          <w:sz w:val="28"/>
+          <w:szCs w:val="28"/>
+        </w:rPr>
+        <w:t xml:space="preserve">») – это учитывается в дальнейшем в стиле приложения и в фильтрах при поиске. Данные ресторанов </w:t>
+      </w:r>
+      <w:r>
+        <w:rPr>
+          <w:rFonts w:ascii="Times New Roman" w:hAnsi="Times New Roman" w:cs="Times New Roman"/>
+          <w:sz w:val="28"/>
+          <w:szCs w:val="28"/>
+        </w:rPr>
+        <w:t xml:space="preserve">приходят </w:t>
+      </w:r>
+      <w:r>
+        <w:rPr>
+          <w:rFonts w:ascii="Times New Roman" w:hAnsi="Times New Roman" w:cs="Times New Roman"/>
+          <w:sz w:val="28"/>
+          <w:szCs w:val="28"/>
+        </w:rPr>
+        <w:t xml:space="preserve">с сервера с БД </w:t>
+      </w:r>
+      <w:r>
+        <w:rPr>
+          <w:rFonts w:ascii="Times New Roman" w:hAnsi="Times New Roman" w:cs="Times New Roman"/>
+          <w:sz w:val="28"/>
+          <w:szCs w:val="28"/>
+        </w:rPr>
+        <w:t xml:space="preserve">(предположительно </w:t>
+      </w:r>
+      <w:proofErr w:type="spellStart"/>
+      <w:r>
+        <w:rPr>
+          <w:rFonts w:ascii="Times New Roman" w:hAnsi="Times New Roman" w:cs="Times New Roman"/>
+          <w:sz w:val="28"/>
+          <w:szCs w:val="28"/>
           <w:lang w:val="en-US"/>
         </w:rPr>
-        <w:t>API</w:t>
-      </w:r>
-      <w:r>
-        <w:t xml:space="preserve"> (</w:t>
-      </w:r>
-      <w:r>
-        <w:t xml:space="preserve">предположительно </w:t>
-      </w:r>
-      <w:proofErr w:type="spellStart"/>
-      <w:r>
-        <w:rPr>
-          <w:lang w:val="en-US"/>
-        </w:rPr>
         <w:t>PocketBase</w:t>
       </w:r>
       <w:proofErr w:type="spellEnd"/>
       <w:r>
+        <w:rPr>
+          <w:rFonts w:ascii="Times New Roman" w:hAnsi="Times New Roman" w:cs="Times New Roman"/>
+          <w:sz w:val="28"/>
+          <w:szCs w:val="28"/>
+        </w:rPr>
         <w:t xml:space="preserve">). </w:t>
       </w:r>
     </w:p>
     <w:p>
-      <w:r>
+      <w:pPr>
+        <w:spacing w:after="0" w:line="360" w:lineRule="auto"/>
+        <w:ind w:firstLine="709"/>
+        <w:jc w:val="both"/>
+        <w:rPr>
+          <w:rFonts w:ascii="Times New Roman" w:hAnsi="Times New Roman" w:cs="Times New Roman"/>
+          <w:sz w:val="28"/>
+          <w:szCs w:val="28"/>
+        </w:rPr>
+      </w:pPr>
+      <w:r>
+        <w:rPr>
+          <w:rFonts w:ascii="Times New Roman" w:hAnsi="Times New Roman" w:cs="Times New Roman"/>
+          <w:sz w:val="28"/>
+          <w:szCs w:val="28"/>
+        </w:rPr>
         <w:t>Искать места можно на карте или в списке по фильтрам и бронировать свободные даты и время.</w:t>
       </w:r>
     </w:p>
     <w:p>
-      <w:r>
+      <w:pPr>
+        <w:spacing w:after="0" w:line="360" w:lineRule="auto"/>
+        <w:ind w:firstLine="709"/>
+        <w:jc w:val="both"/>
+        <w:rPr>
+          <w:rFonts w:ascii="Times New Roman" w:hAnsi="Times New Roman" w:cs="Times New Roman"/>
+          <w:sz w:val="28"/>
+          <w:szCs w:val="28"/>
+        </w:rPr>
+      </w:pPr>
+      <w:r>
+        <w:rPr>
+          <w:rFonts w:ascii="Times New Roman" w:hAnsi="Times New Roman" w:cs="Times New Roman"/>
+          <w:sz w:val="28"/>
+          <w:szCs w:val="28"/>
+        </w:rPr>
         <w:t xml:space="preserve">Если не хочется использовать поиск – можно написать запрос в ИИ </w:t>
       </w:r>
       <w:r>
+        <w:rPr>
+          <w:rFonts w:ascii="Times New Roman" w:hAnsi="Times New Roman" w:cs="Times New Roman"/>
+          <w:sz w:val="28"/>
+          <w:szCs w:val="28"/>
+        </w:rPr>
         <w:t>словами,</w:t>
       </w:r>
       <w:r>
+        <w:rPr>
+          <w:rFonts w:ascii="Times New Roman" w:hAnsi="Times New Roman" w:cs="Times New Roman"/>
+          <w:sz w:val="28"/>
+          <w:szCs w:val="28"/>
+        </w:rPr>
         <w:t xml:space="preserve"> и он подберет подходящие варианты. Поиск также осуществляется с использованием геолокации (места рядом, в определённом радиусе)</w:t>
       </w:r>
     </w:p>
     <w:p>
-      <w:r>
+      <w:pPr>
+        <w:spacing w:after="0" w:line="360" w:lineRule="auto"/>
+        <w:ind w:firstLine="709"/>
+        <w:jc w:val="both"/>
+        <w:rPr>
+          <w:rFonts w:ascii="Times New Roman" w:hAnsi="Times New Roman" w:cs="Times New Roman"/>
+          <w:sz w:val="28"/>
+          <w:szCs w:val="28"/>
+        </w:rPr>
+      </w:pPr>
+      <w:r>
+        <w:rPr>
+          <w:rFonts w:ascii="Times New Roman" w:hAnsi="Times New Roman" w:cs="Times New Roman"/>
+          <w:sz w:val="28"/>
+          <w:szCs w:val="28"/>
+        </w:rPr>
         <w:t>После посещения в приложении в разделе «Воспоминания» сохраняется история посещений, где можно прикрепить фото или оставить впечатление</w:t>
       </w:r>
     </w:p>
     <w:p>
-      <w:r>
+      <w:pPr>
+        <w:spacing w:after="0" w:line="360" w:lineRule="auto"/>
+        <w:ind w:firstLine="709"/>
+        <w:jc w:val="both"/>
+        <w:rPr>
+          <w:rFonts w:ascii="Times New Roman" w:hAnsi="Times New Roman" w:cs="Times New Roman"/>
+          <w:sz w:val="28"/>
+          <w:szCs w:val="28"/>
+        </w:rPr>
+      </w:pPr>
+      <w:r>
+        <w:rPr>
+          <w:rFonts w:ascii="Times New Roman" w:hAnsi="Times New Roman" w:cs="Times New Roman"/>
+          <w:sz w:val="28"/>
+          <w:szCs w:val="28"/>
+        </w:rPr>
         <w:t>*Название приложения, разделов и режимов являются рабочими и с большой вероятностью могут быть изменены</w:t>
       </w:r>
       <w:r>
+        <w:rPr>
+          <w:rFonts w:ascii="Times New Roman" w:hAnsi="Times New Roman" w:cs="Times New Roman"/>
+          <w:sz w:val="28"/>
+          <w:szCs w:val="28"/>
+        </w:rPr>
         <w:t xml:space="preserve"> в процессе проектирования и разработки</w:t>
+      </w:r>
+      <w:r>
+        <w:rPr>
+          <w:rFonts w:ascii="Times New Roman" w:hAnsi="Times New Roman" w:cs="Times New Roman"/>
+          <w:sz w:val="28"/>
+          <w:szCs w:val="28"/>
+        </w:rPr>
+        <w:t>.</w:t>
+      </w:r>
+      <w:r>
+        <w:rPr>
+          <w:rFonts w:ascii="Times New Roman" w:hAnsi="Times New Roman" w:cs="Times New Roman"/>
+          <w:sz w:val="28"/>
+          <w:szCs w:val="28"/>
+        </w:rPr>
+        <w:t xml:space="preserve"> Более подробное планирование реализации будет </w:t>
+      </w:r>
+      <w:r>
+        <w:rPr>
+          <w:rFonts w:ascii="Times New Roman" w:hAnsi="Times New Roman" w:cs="Times New Roman"/>
+          <w:sz w:val="28"/>
+          <w:szCs w:val="28"/>
+        </w:rPr>
+        <w:t>представлено</w:t>
+      </w:r>
+      <w:r>
+        <w:rPr>
+          <w:rFonts w:ascii="Times New Roman" w:hAnsi="Times New Roman" w:cs="Times New Roman"/>
+          <w:sz w:val="28"/>
+          <w:szCs w:val="28"/>
+        </w:rPr>
+        <w:t xml:space="preserve"> в другой технической документации.</w:t>
+      </w:r>
+    </w:p>
+    <w:p>
+      <w:pPr>
+        <w:spacing w:after="0" w:line="360" w:lineRule="auto"/>
+        <w:ind w:firstLine="709"/>
+        <w:jc w:val="both"/>
+        <w:rPr>
+          <w:rFonts w:ascii="Times New Roman" w:hAnsi="Times New Roman" w:cs="Times New Roman"/>
+          <w:sz w:val="28"/>
+          <w:szCs w:val="28"/>
+        </w:rPr>
+      </w:pPr>
+      <w:r>
+        <w:rPr>
+          <w:rFonts w:ascii="Times New Roman" w:hAnsi="Times New Roman" w:cs="Times New Roman"/>
+          <w:sz w:val="28"/>
+          <w:szCs w:val="28"/>
+        </w:rPr>
+        <w:t>Сравнение с аналогами</w:t>
+      </w:r>
+      <w:r>
+        <w:rPr>
+          <w:rFonts w:ascii="Times New Roman" w:hAnsi="Times New Roman" w:cs="Times New Roman"/>
+          <w:sz w:val="28"/>
+          <w:szCs w:val="28"/>
+        </w:rPr>
+        <w:t>:</w:t>
+      </w:r>
+    </w:p>
+    <w:p>
+      <w:pPr>
+        <w:spacing w:after="0" w:line="360" w:lineRule="auto"/>
+        <w:ind w:firstLine="709"/>
+        <w:jc w:val="both"/>
+        <w:rPr>
+          <w:rFonts w:ascii="Times New Roman" w:hAnsi="Times New Roman" w:cs="Times New Roman"/>
+          <w:sz w:val="28"/>
+          <w:szCs w:val="28"/>
+        </w:rPr>
+      </w:pPr>
+      <w:r>
+        <w:rPr>
+          <w:rFonts w:ascii="Times New Roman" w:hAnsi="Times New Roman" w:cs="Times New Roman"/>
+          <w:sz w:val="28"/>
+          <w:szCs w:val="28"/>
+        </w:rPr>
+        <w:t>Основные аналоги</w:t>
+      </w:r>
+      <w:r>
+        <w:rPr>
+          <w:rFonts w:ascii="Times New Roman" w:hAnsi="Times New Roman" w:cs="Times New Roman"/>
+          <w:sz w:val="28"/>
+          <w:szCs w:val="28"/>
+        </w:rPr>
+        <w:t xml:space="preserve"> представлены иностранными сервисами (не поддерживаемыми или ограниченными в России)</w:t>
+      </w:r>
+    </w:p>
+    <w:p>
+      <w:pPr>
+        <w:pStyle w:val="a7"/>
+        <w:numPr>
+          <w:ilvl w:val="0"/>
+          <w:numId w:val="2"/>
+        </w:numPr>
+        <w:spacing w:after="0" w:line="360" w:lineRule="auto"/>
+        <w:ind w:left="0" w:firstLine="709"/>
+        <w:jc w:val="both"/>
+        <w:rPr>
+          <w:rFonts w:ascii="Times New Roman" w:hAnsi="Times New Roman" w:cs="Times New Roman"/>
+          <w:sz w:val="28"/>
+          <w:szCs w:val="28"/>
+        </w:rPr>
+      </w:pPr>
+      <w:proofErr w:type="spellStart"/>
+      <w:r>
+        <w:rPr>
+          <w:rFonts w:ascii="Times New Roman" w:hAnsi="Times New Roman" w:cs="Times New Roman"/>
+          <w:sz w:val="28"/>
+          <w:szCs w:val="28"/>
+          <w:lang w:val="en-US"/>
+        </w:rPr>
+        <w:t>Tripadvisor</w:t>
+      </w:r>
+      <w:proofErr w:type="spellEnd"/>
+    </w:p>
+    <w:p>
+      <w:pPr>
+        <w:pStyle w:val="a7"/>
+        <w:numPr>
+          <w:ilvl w:val="0"/>
+          <w:numId w:val="2"/>
+        </w:numPr>
+        <w:spacing w:after="0" w:line="360" w:lineRule="auto"/>
+        <w:ind w:left="0" w:firstLine="709"/>
+        <w:jc w:val="both"/>
+        <w:rPr>
+          <w:rFonts w:ascii="Times New Roman" w:hAnsi="Times New Roman" w:cs="Times New Roman"/>
+          <w:sz w:val="28"/>
+          <w:szCs w:val="28"/>
+        </w:rPr>
+      </w:pPr>
+      <w:r>
+        <w:rPr>
+          <w:rFonts w:ascii="Times New Roman" w:hAnsi="Times New Roman" w:cs="Times New Roman"/>
+          <w:sz w:val="28"/>
+          <w:szCs w:val="28"/>
+          <w:lang w:val="en-US"/>
+        </w:rPr>
+        <w:t>OpenTable</w:t>
+      </w:r>
+    </w:p>
+    <w:p>
+      <w:pPr>
+        <w:pStyle w:val="a7"/>
+        <w:numPr>
+          <w:ilvl w:val="0"/>
+          <w:numId w:val="2"/>
+        </w:numPr>
+        <w:spacing w:after="0" w:line="360" w:lineRule="auto"/>
+        <w:ind w:left="0" w:firstLine="709"/>
+        <w:jc w:val="both"/>
+        <w:rPr>
+          <w:rFonts w:ascii="Times New Roman" w:hAnsi="Times New Roman" w:cs="Times New Roman"/>
+          <w:sz w:val="28"/>
+          <w:szCs w:val="28"/>
+        </w:rPr>
+      </w:pPr>
+      <w:r>
+        <w:rPr>
+          <w:rFonts w:ascii="Times New Roman" w:hAnsi="Times New Roman" w:cs="Times New Roman"/>
+          <w:sz w:val="28"/>
+          <w:szCs w:val="28"/>
+          <w:lang w:val="en-US"/>
+        </w:rPr>
+        <w:t>Yelp</w:t>
+      </w:r>
+    </w:p>
+    <w:tbl>
+      <w:tblPr>
+        <w:tblStyle w:val="ac"/>
+        <w:tblW w:w="0" w:type="auto"/>
+        <w:tblLook w:val="04A0" w:firstRow="1" w:lastRow="0" w:firstColumn="1" w:lastColumn="0" w:noHBand="0" w:noVBand="1"/>
+      </w:tblPr>
+      <w:tblGrid>
+        <w:gridCol w:w="404"/>
+        <w:gridCol w:w="1189"/>
+        <w:gridCol w:w="1492"/>
+        <w:gridCol w:w="1618"/>
+        <w:gridCol w:w="1364"/>
+        <w:gridCol w:w="1660"/>
+        <w:gridCol w:w="1618"/>
+      </w:tblGrid>
+      <w:tr>
+        <w:tc>
+          <w:tcPr>
+            <w:tcW w:w="418" w:type="dxa"/>
+          </w:tcPr>
+          <w:p>
+            <w:pPr>
+              <w:pStyle w:val="a7"/>
+              <w:ind w:left="0"/>
+              <w:jc w:val="both"/>
+              <w:rPr>
+                <w:rFonts w:ascii="Times New Roman" w:hAnsi="Times New Roman" w:cs="Times New Roman"/>
+              </w:rPr>
+            </w:pPr>
+            <w:r>
+              <w:rPr>
+                <w:rFonts w:ascii="Times New Roman" w:hAnsi="Times New Roman" w:cs="Times New Roman"/>
+              </w:rPr>
+              <w:t>№</w:t>
+            </w:r>
+          </w:p>
+        </w:tc>
+        <w:tc>
+          <w:tcPr>
+            <w:tcW w:w="1255" w:type="dxa"/>
+          </w:tcPr>
+          <w:p>
+            <w:pPr>
+              <w:pStyle w:val="a7"/>
+              <w:ind w:left="0"/>
+              <w:jc w:val="both"/>
+              <w:rPr>
+                <w:rFonts w:ascii="Times New Roman" w:hAnsi="Times New Roman" w:cs="Times New Roman"/>
+              </w:rPr>
+            </w:pPr>
+            <w:r>
+              <w:rPr>
+                <w:rFonts w:ascii="Times New Roman" w:hAnsi="Times New Roman" w:cs="Times New Roman"/>
+              </w:rPr>
+              <w:t>Название</w:t>
+            </w:r>
+          </w:p>
+        </w:tc>
+        <w:tc>
+          <w:tcPr>
+            <w:tcW w:w="1579" w:type="dxa"/>
+          </w:tcPr>
+          <w:p>
+            <w:pPr>
+              <w:pStyle w:val="a7"/>
+              <w:ind w:left="0"/>
+              <w:jc w:val="both"/>
+              <w:rPr>
+                <w:rFonts w:ascii="Times New Roman" w:hAnsi="Times New Roman" w:cs="Times New Roman"/>
+              </w:rPr>
+            </w:pPr>
+            <w:r>
+              <w:rPr>
+                <w:rFonts w:ascii="Times New Roman" w:hAnsi="Times New Roman" w:cs="Times New Roman"/>
+              </w:rPr>
+              <w:t>Особенности поиск</w:t>
+            </w:r>
+          </w:p>
+        </w:tc>
+        <w:tc>
+          <w:tcPr>
+            <w:tcW w:w="1767" w:type="dxa"/>
+          </w:tcPr>
+          <w:p>
+            <w:pPr>
+              <w:pStyle w:val="a7"/>
+              <w:ind w:left="0"/>
+              <w:jc w:val="both"/>
+              <w:rPr>
+                <w:rFonts w:ascii="Times New Roman" w:hAnsi="Times New Roman" w:cs="Times New Roman"/>
+              </w:rPr>
+            </w:pPr>
+            <w:r>
+              <w:rPr>
+                <w:rFonts w:ascii="Times New Roman" w:hAnsi="Times New Roman" w:cs="Times New Roman"/>
+              </w:rPr>
+              <w:t>Направленность объектов бронирования</w:t>
+            </w:r>
+          </w:p>
+        </w:tc>
+        <w:tc>
+          <w:tcPr>
+            <w:tcW w:w="1644" w:type="dxa"/>
+          </w:tcPr>
+          <w:p>
+            <w:pPr>
+              <w:pStyle w:val="a7"/>
+              <w:ind w:left="0"/>
+              <w:jc w:val="both"/>
+              <w:rPr>
+                <w:rFonts w:ascii="Times New Roman" w:hAnsi="Times New Roman" w:cs="Times New Roman"/>
+              </w:rPr>
+            </w:pPr>
+            <w:r>
+              <w:rPr>
+                <w:rFonts w:ascii="Times New Roman" w:hAnsi="Times New Roman" w:cs="Times New Roman"/>
+              </w:rPr>
+              <w:t>ИИ-интеграция</w:t>
+            </w:r>
+          </w:p>
+        </w:tc>
+        <w:tc>
+          <w:tcPr>
+            <w:tcW w:w="1488" w:type="dxa"/>
+          </w:tcPr>
+          <w:p>
+            <w:pPr>
+              <w:pStyle w:val="a7"/>
+              <w:ind w:left="0"/>
+              <w:jc w:val="both"/>
+              <w:rPr>
+                <w:rFonts w:ascii="Times New Roman" w:hAnsi="Times New Roman" w:cs="Times New Roman"/>
+              </w:rPr>
+            </w:pPr>
+            <w:r>
+              <w:rPr>
+                <w:rFonts w:ascii="Times New Roman" w:hAnsi="Times New Roman" w:cs="Times New Roman"/>
+              </w:rPr>
+              <w:t>Персонализация</w:t>
+            </w:r>
+          </w:p>
+        </w:tc>
+        <w:tc>
+          <w:tcPr>
+            <w:tcW w:w="1625" w:type="dxa"/>
+          </w:tcPr>
+          <w:p>
+            <w:pPr>
+              <w:pStyle w:val="a7"/>
+              <w:ind w:left="0"/>
+              <w:jc w:val="both"/>
+              <w:rPr>
+                <w:rFonts w:ascii="Times New Roman" w:hAnsi="Times New Roman" w:cs="Times New Roman"/>
+              </w:rPr>
+            </w:pPr>
+            <w:r>
+              <w:rPr>
+                <w:rFonts w:ascii="Times New Roman" w:hAnsi="Times New Roman" w:cs="Times New Roman"/>
+              </w:rPr>
+              <w:t>Отличительные фичи</w:t>
+            </w:r>
+          </w:p>
+        </w:tc>
+      </w:tr>
+      <w:tr>
+        <w:tc>
+          <w:tcPr>
+            <w:tcW w:w="418" w:type="dxa"/>
+          </w:tcPr>
+          <w:p>
+            <w:pPr>
+              <w:pStyle w:val="a7"/>
+              <w:ind w:left="0"/>
+              <w:jc w:val="both"/>
+              <w:rPr>
+                <w:rFonts w:ascii="Times New Roman" w:hAnsi="Times New Roman" w:cs="Times New Roman"/>
+              </w:rPr>
+            </w:pPr>
+            <w:r>
+              <w:rPr>
+                <w:rFonts w:ascii="Times New Roman" w:hAnsi="Times New Roman" w:cs="Times New Roman"/>
+              </w:rPr>
+              <w:t>1</w:t>
+            </w:r>
+          </w:p>
+        </w:tc>
+        <w:tc>
+          <w:tcPr>
+            <w:tcW w:w="1255" w:type="dxa"/>
+          </w:tcPr>
+          <w:p>
+            <w:pPr>
+              <w:pStyle w:val="a7"/>
+              <w:ind w:left="0"/>
+              <w:jc w:val="both"/>
+              <w:rPr>
+                <w:rFonts w:ascii="Times New Roman" w:hAnsi="Times New Roman" w:cs="Times New Roman"/>
+              </w:rPr>
+            </w:pPr>
+            <w:proofErr w:type="spellStart"/>
+            <w:r>
+              <w:rPr>
+                <w:rFonts w:ascii="Times New Roman" w:hAnsi="Times New Roman" w:cs="Times New Roman"/>
+                <w:lang w:val="en-US"/>
+              </w:rPr>
+              <w:t>WheresVibe</w:t>
+            </w:r>
+            <w:proofErr w:type="spellEnd"/>
+          </w:p>
+        </w:tc>
+        <w:tc>
+          <w:tcPr>
+            <w:tcW w:w="1579" w:type="dxa"/>
+          </w:tcPr>
+          <w:p>
+            <w:pPr>
+              <w:pStyle w:val="a7"/>
+              <w:ind w:left="0"/>
+              <w:jc w:val="both"/>
+              <w:rPr>
+                <w:rFonts w:ascii="Times New Roman" w:hAnsi="Times New Roman" w:cs="Times New Roman"/>
+              </w:rPr>
+            </w:pPr>
+            <w:r>
+              <w:rPr>
+                <w:rFonts w:ascii="Times New Roman" w:hAnsi="Times New Roman" w:cs="Times New Roman"/>
+              </w:rPr>
+              <w:t>Фильтры по категориям, поиск по названию. Учитывается «</w:t>
+            </w:r>
+            <w:proofErr w:type="spellStart"/>
+            <w:r>
+              <w:rPr>
+                <w:rFonts w:ascii="Times New Roman" w:hAnsi="Times New Roman" w:cs="Times New Roman"/>
+              </w:rPr>
+              <w:t>вайб</w:t>
+            </w:r>
+            <w:proofErr w:type="spellEnd"/>
+            <w:r>
+              <w:rPr>
+                <w:rFonts w:ascii="Times New Roman" w:hAnsi="Times New Roman" w:cs="Times New Roman"/>
+              </w:rPr>
+              <w:t xml:space="preserve">» </w:t>
+            </w:r>
+            <w:r>
+              <w:rPr>
+                <w:rFonts w:ascii="Times New Roman" w:hAnsi="Times New Roman" w:cs="Times New Roman"/>
+              </w:rPr>
+              <w:lastRenderedPageBreak/>
+              <w:t xml:space="preserve">(как особая категория) при поиске для фильтрации всего поиска. Присутствует </w:t>
+            </w:r>
+            <w:r>
+              <w:rPr>
+                <w:rFonts w:ascii="Times New Roman" w:hAnsi="Times New Roman" w:cs="Times New Roman"/>
+                <w:lang w:val="en-US"/>
+              </w:rPr>
+              <w:t>AI</w:t>
+            </w:r>
+            <w:r>
+              <w:rPr>
+                <w:rFonts w:ascii="Times New Roman" w:hAnsi="Times New Roman" w:cs="Times New Roman"/>
+              </w:rPr>
+              <w:t>-поиск, места отображаются на карте, а также поиск мест рядом (определенный интервал относительно геолокации)</w:t>
+            </w:r>
+          </w:p>
+        </w:tc>
+        <w:tc>
+          <w:tcPr>
+            <w:tcW w:w="1767" w:type="dxa"/>
+          </w:tcPr>
+          <w:p>
+            <w:pPr>
+              <w:jc w:val="both"/>
+              <w:rPr>
+                <w:rFonts w:ascii="Times New Roman" w:hAnsi="Times New Roman" w:cs="Times New Roman"/>
+              </w:rPr>
+            </w:pPr>
+            <w:r>
+              <w:rPr>
+                <w:rFonts w:ascii="Times New Roman" w:hAnsi="Times New Roman" w:cs="Times New Roman"/>
+              </w:rPr>
+              <w:lastRenderedPageBreak/>
+              <w:t xml:space="preserve">В основном рестораны и кафе, или развлекательные места с почасовым </w:t>
+            </w:r>
+            <w:r>
+              <w:rPr>
+                <w:rFonts w:ascii="Times New Roman" w:hAnsi="Times New Roman" w:cs="Times New Roman"/>
+              </w:rPr>
+              <w:lastRenderedPageBreak/>
+              <w:t>бронированием</w:t>
+            </w:r>
+          </w:p>
+        </w:tc>
+        <w:tc>
+          <w:tcPr>
+            <w:tcW w:w="1644" w:type="dxa"/>
+          </w:tcPr>
+          <w:p>
+            <w:pPr>
+              <w:pStyle w:val="a7"/>
+              <w:ind w:left="0"/>
+              <w:jc w:val="both"/>
+              <w:rPr>
+                <w:rFonts w:ascii="Times New Roman" w:hAnsi="Times New Roman" w:cs="Times New Roman"/>
+              </w:rPr>
+            </w:pPr>
+            <w:r>
+              <w:rPr>
+                <w:rFonts w:ascii="Times New Roman" w:hAnsi="Times New Roman" w:cs="Times New Roman"/>
+              </w:rPr>
+              <w:lastRenderedPageBreak/>
+              <w:t xml:space="preserve">Присутствует в виде </w:t>
+            </w:r>
+            <w:r>
+              <w:rPr>
+                <w:rFonts w:ascii="Times New Roman" w:hAnsi="Times New Roman" w:cs="Times New Roman"/>
+                <w:lang w:val="en-US"/>
+              </w:rPr>
+              <w:t>AI</w:t>
+            </w:r>
+            <w:r>
+              <w:rPr>
+                <w:rFonts w:ascii="Times New Roman" w:hAnsi="Times New Roman" w:cs="Times New Roman"/>
+              </w:rPr>
+              <w:t>-поиска</w:t>
+            </w:r>
+          </w:p>
+        </w:tc>
+        <w:tc>
+          <w:tcPr>
+            <w:tcW w:w="1488" w:type="dxa"/>
+          </w:tcPr>
+          <w:p>
+            <w:pPr>
+              <w:pStyle w:val="a7"/>
+              <w:ind w:left="0"/>
+              <w:jc w:val="both"/>
+              <w:rPr>
+                <w:rFonts w:ascii="Times New Roman" w:hAnsi="Times New Roman" w:cs="Times New Roman"/>
+              </w:rPr>
+            </w:pPr>
+            <w:r>
+              <w:rPr>
+                <w:rFonts w:ascii="Times New Roman" w:hAnsi="Times New Roman" w:cs="Times New Roman"/>
+              </w:rPr>
+              <w:t xml:space="preserve">Авторизация, история бронирований, раздел «Воспоминания» с </w:t>
+            </w:r>
+            <w:r>
+              <w:rPr>
+                <w:rFonts w:ascii="Times New Roman" w:hAnsi="Times New Roman" w:cs="Times New Roman"/>
+              </w:rPr>
+              <w:lastRenderedPageBreak/>
+              <w:t>добавлением фото и впечатлений (не отзывы, приватные), выбор «</w:t>
+            </w:r>
+            <w:proofErr w:type="spellStart"/>
+            <w:r>
+              <w:rPr>
+                <w:rFonts w:ascii="Times New Roman" w:hAnsi="Times New Roman" w:cs="Times New Roman"/>
+              </w:rPr>
+              <w:t>вайба</w:t>
+            </w:r>
+            <w:proofErr w:type="spellEnd"/>
+            <w:r>
+              <w:rPr>
+                <w:rFonts w:ascii="Times New Roman" w:hAnsi="Times New Roman" w:cs="Times New Roman"/>
+              </w:rPr>
+              <w:t>» при поиске</w:t>
+            </w:r>
+          </w:p>
+        </w:tc>
+        <w:tc>
+          <w:tcPr>
+            <w:tcW w:w="1625" w:type="dxa"/>
+          </w:tcPr>
+          <w:p>
+            <w:pPr>
+              <w:pStyle w:val="a7"/>
+              <w:ind w:left="0"/>
+              <w:jc w:val="both"/>
+              <w:rPr>
+                <w:rFonts w:ascii="Times New Roman" w:hAnsi="Times New Roman" w:cs="Times New Roman"/>
+              </w:rPr>
+            </w:pPr>
+            <w:r>
+              <w:rPr>
+                <w:rFonts w:ascii="Times New Roman" w:hAnsi="Times New Roman" w:cs="Times New Roman"/>
+                <w:lang w:val="en-US"/>
+              </w:rPr>
+              <w:lastRenderedPageBreak/>
+              <w:t>AI</w:t>
+            </w:r>
+            <w:r>
+              <w:rPr>
+                <w:rFonts w:ascii="Times New Roman" w:hAnsi="Times New Roman" w:cs="Times New Roman"/>
+              </w:rPr>
+              <w:t xml:space="preserve">-поиск, раздел воспоминаний, </w:t>
+            </w:r>
+            <w:r>
+              <w:rPr>
+                <w:rFonts w:ascii="Times New Roman" w:hAnsi="Times New Roman" w:cs="Times New Roman"/>
+              </w:rPr>
+              <w:t xml:space="preserve">выбор направленности заведения </w:t>
+            </w:r>
+            <w:r>
+              <w:rPr>
+                <w:rFonts w:ascii="Times New Roman" w:hAnsi="Times New Roman" w:cs="Times New Roman"/>
+              </w:rPr>
+              <w:lastRenderedPageBreak/>
+              <w:t>перед поиском</w:t>
+            </w:r>
+          </w:p>
+        </w:tc>
+      </w:tr>
+      <w:tr>
+        <w:tc>
+          <w:tcPr>
+            <w:tcW w:w="418" w:type="dxa"/>
+          </w:tcPr>
+          <w:p>
+            <w:pPr>
+              <w:pStyle w:val="a7"/>
+              <w:ind w:left="0"/>
+              <w:jc w:val="both"/>
+              <w:rPr>
+                <w:rFonts w:ascii="Times New Roman" w:hAnsi="Times New Roman" w:cs="Times New Roman"/>
+              </w:rPr>
+            </w:pPr>
+            <w:r>
+              <w:rPr>
+                <w:rFonts w:ascii="Times New Roman" w:hAnsi="Times New Roman" w:cs="Times New Roman"/>
+              </w:rPr>
+              <w:lastRenderedPageBreak/>
+              <w:t>2</w:t>
+            </w:r>
+          </w:p>
+        </w:tc>
+        <w:tc>
+          <w:tcPr>
+            <w:tcW w:w="1255" w:type="dxa"/>
+          </w:tcPr>
+          <w:p>
+            <w:pPr>
+              <w:jc w:val="both"/>
+              <w:rPr>
+                <w:rFonts w:ascii="Times New Roman" w:hAnsi="Times New Roman" w:cs="Times New Roman"/>
+              </w:rPr>
+            </w:pPr>
+            <w:proofErr w:type="spellStart"/>
+            <w:r>
+              <w:rPr>
+                <w:rFonts w:ascii="Times New Roman" w:hAnsi="Times New Roman" w:cs="Times New Roman"/>
+                <w:lang w:val="en-US"/>
+              </w:rPr>
+              <w:t>Tripadvisor</w:t>
+            </w:r>
+            <w:proofErr w:type="spellEnd"/>
+          </w:p>
+          <w:p>
+            <w:pPr>
+              <w:pStyle w:val="a7"/>
+              <w:ind w:left="0"/>
+              <w:jc w:val="both"/>
+              <w:rPr>
+                <w:rFonts w:ascii="Times New Roman" w:hAnsi="Times New Roman" w:cs="Times New Roman"/>
+              </w:rPr>
+            </w:pPr>
+          </w:p>
+        </w:tc>
+        <w:tc>
+          <w:tcPr>
+            <w:tcW w:w="1579" w:type="dxa"/>
+          </w:tcPr>
+          <w:p>
+            <w:pPr>
+              <w:pStyle w:val="a7"/>
+              <w:ind w:left="0"/>
+              <w:jc w:val="both"/>
+              <w:rPr>
+                <w:rFonts w:ascii="Times New Roman" w:hAnsi="Times New Roman" w:cs="Times New Roman"/>
+              </w:rPr>
+            </w:pPr>
+            <w:r>
+              <w:rPr>
+                <w:rFonts w:ascii="Times New Roman" w:hAnsi="Times New Roman" w:cs="Times New Roman"/>
+              </w:rPr>
+              <w:t xml:space="preserve">Фильтры по категориям, расположению поиск по названию или описанию. Есть поиск на карте, учитывает геолокацию в рамках города. </w:t>
+            </w:r>
+            <w:r>
+              <w:rPr>
+                <w:rFonts w:ascii="Times New Roman" w:hAnsi="Times New Roman" w:cs="Times New Roman"/>
+              </w:rPr>
+              <w:t xml:space="preserve">Присутствует </w:t>
+            </w:r>
+            <w:r>
+              <w:rPr>
+                <w:rFonts w:ascii="Times New Roman" w:hAnsi="Times New Roman" w:cs="Times New Roman"/>
+                <w:lang w:val="en-US"/>
+              </w:rPr>
+              <w:t>AI</w:t>
+            </w:r>
+            <w:r>
+              <w:rPr>
+                <w:rFonts w:ascii="Times New Roman" w:hAnsi="Times New Roman" w:cs="Times New Roman"/>
+              </w:rPr>
+              <w:t>-поиск</w:t>
+            </w:r>
+          </w:p>
+        </w:tc>
+        <w:tc>
+          <w:tcPr>
+            <w:tcW w:w="1767" w:type="dxa"/>
+          </w:tcPr>
+          <w:p>
+            <w:pPr>
+              <w:pStyle w:val="a7"/>
+              <w:ind w:left="0"/>
+              <w:jc w:val="both"/>
+              <w:rPr>
+                <w:rFonts w:ascii="Times New Roman" w:hAnsi="Times New Roman" w:cs="Times New Roman"/>
+              </w:rPr>
+            </w:pPr>
+            <w:r>
+              <w:rPr>
+                <w:rFonts w:ascii="Times New Roman" w:hAnsi="Times New Roman" w:cs="Times New Roman"/>
+              </w:rPr>
+              <w:t>Бронирование отелей, кафе и ресторанов</w:t>
+            </w:r>
+          </w:p>
+        </w:tc>
+        <w:tc>
+          <w:tcPr>
+            <w:tcW w:w="1644" w:type="dxa"/>
+          </w:tcPr>
+          <w:p>
+            <w:pPr>
+              <w:pStyle w:val="a7"/>
+              <w:ind w:left="0"/>
+              <w:jc w:val="both"/>
+              <w:rPr>
+                <w:rFonts w:ascii="Times New Roman" w:hAnsi="Times New Roman" w:cs="Times New Roman"/>
+              </w:rPr>
+            </w:pPr>
+            <w:r>
+              <w:rPr>
+                <w:rFonts w:ascii="Times New Roman" w:hAnsi="Times New Roman" w:cs="Times New Roman"/>
+              </w:rPr>
+              <w:t xml:space="preserve">Присутствует в виде </w:t>
+            </w:r>
+            <w:r>
+              <w:rPr>
+                <w:rFonts w:ascii="Times New Roman" w:hAnsi="Times New Roman" w:cs="Times New Roman"/>
+                <w:lang w:val="en-US"/>
+              </w:rPr>
+              <w:t>AI</w:t>
+            </w:r>
+            <w:r>
+              <w:rPr>
+                <w:rFonts w:ascii="Times New Roman" w:hAnsi="Times New Roman" w:cs="Times New Roman"/>
+              </w:rPr>
+              <w:t>-поиска</w:t>
+            </w:r>
+          </w:p>
+        </w:tc>
+        <w:tc>
+          <w:tcPr>
+            <w:tcW w:w="1488" w:type="dxa"/>
+          </w:tcPr>
+          <w:p>
+            <w:pPr>
+              <w:pStyle w:val="a7"/>
+              <w:ind w:left="0"/>
+              <w:jc w:val="both"/>
+              <w:rPr>
+                <w:rFonts w:ascii="Times New Roman" w:hAnsi="Times New Roman" w:cs="Times New Roman"/>
+              </w:rPr>
+            </w:pPr>
+            <w:r>
+              <w:rPr>
+                <w:rFonts w:ascii="Times New Roman" w:hAnsi="Times New Roman" w:cs="Times New Roman"/>
+              </w:rPr>
+              <w:t>Авторизация, история бронирований</w:t>
+            </w:r>
+          </w:p>
+        </w:tc>
+        <w:tc>
+          <w:tcPr>
+            <w:tcW w:w="1625" w:type="dxa"/>
+          </w:tcPr>
+          <w:p>
+            <w:pPr>
+              <w:pStyle w:val="a7"/>
+              <w:ind w:left="0"/>
+              <w:jc w:val="both"/>
+              <w:rPr>
+                <w:rFonts w:ascii="Times New Roman" w:hAnsi="Times New Roman" w:cs="Times New Roman"/>
+              </w:rPr>
+            </w:pPr>
+            <w:r>
+              <w:rPr>
+                <w:rFonts w:ascii="Times New Roman" w:hAnsi="Times New Roman" w:cs="Times New Roman"/>
+                <w:lang w:val="en-US"/>
+              </w:rPr>
+              <w:t>AI</w:t>
+            </w:r>
+            <w:r>
+              <w:rPr>
+                <w:rFonts w:ascii="Times New Roman" w:hAnsi="Times New Roman" w:cs="Times New Roman"/>
+              </w:rPr>
+              <w:t>-поиск</w:t>
+            </w:r>
+            <w:r>
+              <w:rPr>
+                <w:rFonts w:ascii="Times New Roman" w:hAnsi="Times New Roman" w:cs="Times New Roman"/>
+              </w:rPr>
+              <w:t>, выбор большого спектра заведений (не только рестораны, но и отели и прочие развлекательные места)</w:t>
+            </w:r>
+          </w:p>
+        </w:tc>
+      </w:tr>
+      <w:tr>
+        <w:tc>
+          <w:tcPr>
+            <w:tcW w:w="418" w:type="dxa"/>
+          </w:tcPr>
+          <w:p>
+            <w:pPr>
+              <w:pStyle w:val="a7"/>
+              <w:ind w:left="0"/>
+              <w:jc w:val="both"/>
+              <w:rPr>
+                <w:rFonts w:ascii="Times New Roman" w:hAnsi="Times New Roman" w:cs="Times New Roman"/>
+              </w:rPr>
+            </w:pPr>
+            <w:r>
+              <w:rPr>
+                <w:rFonts w:ascii="Times New Roman" w:hAnsi="Times New Roman" w:cs="Times New Roman"/>
+              </w:rPr>
+              <w:t>3</w:t>
+            </w:r>
+          </w:p>
+        </w:tc>
+        <w:tc>
+          <w:tcPr>
+            <w:tcW w:w="1255" w:type="dxa"/>
+          </w:tcPr>
+          <w:p>
+            <w:pPr>
+              <w:pStyle w:val="a7"/>
+              <w:ind w:left="0"/>
+              <w:jc w:val="both"/>
+              <w:rPr>
+                <w:rFonts w:ascii="Times New Roman" w:hAnsi="Times New Roman" w:cs="Times New Roman"/>
+              </w:rPr>
+            </w:pPr>
+            <w:proofErr w:type="spellStart"/>
+            <w:r>
+              <w:rPr>
+                <w:rFonts w:ascii="Times New Roman" w:hAnsi="Times New Roman" w:cs="Times New Roman"/>
+              </w:rPr>
+              <w:t>OpenTable</w:t>
+            </w:r>
+            <w:proofErr w:type="spellEnd"/>
+          </w:p>
+        </w:tc>
+        <w:tc>
+          <w:tcPr>
+            <w:tcW w:w="1579" w:type="dxa"/>
+          </w:tcPr>
+          <w:p>
+            <w:pPr>
+              <w:pStyle w:val="a7"/>
+              <w:ind w:left="0"/>
+              <w:jc w:val="both"/>
+              <w:rPr>
+                <w:rFonts w:ascii="Times New Roman" w:hAnsi="Times New Roman" w:cs="Times New Roman"/>
+              </w:rPr>
+            </w:pPr>
+            <w:r>
+              <w:rPr>
+                <w:rFonts w:ascii="Times New Roman" w:hAnsi="Times New Roman" w:cs="Times New Roman"/>
+              </w:rPr>
+              <w:t>Фильтры по категориям,</w:t>
+            </w:r>
+            <w:r>
+              <w:rPr>
+                <w:rFonts w:ascii="Times New Roman" w:hAnsi="Times New Roman" w:cs="Times New Roman"/>
+              </w:rPr>
+              <w:t xml:space="preserve"> </w:t>
+            </w:r>
+            <w:r>
+              <w:rPr>
+                <w:rFonts w:ascii="Times New Roman" w:hAnsi="Times New Roman" w:cs="Times New Roman"/>
+              </w:rPr>
+              <w:t>поиск по названию или описанию</w:t>
+            </w:r>
+            <w:r>
+              <w:rPr>
+                <w:rFonts w:ascii="Times New Roman" w:hAnsi="Times New Roman" w:cs="Times New Roman"/>
+              </w:rPr>
+              <w:t>, поиск на карте</w:t>
+            </w:r>
+          </w:p>
+        </w:tc>
+        <w:tc>
+          <w:tcPr>
+            <w:tcW w:w="1767" w:type="dxa"/>
+          </w:tcPr>
+          <w:p>
+            <w:pPr>
+              <w:pStyle w:val="a7"/>
+              <w:ind w:left="0"/>
+              <w:jc w:val="both"/>
+              <w:rPr>
+                <w:rFonts w:ascii="Times New Roman" w:hAnsi="Times New Roman" w:cs="Times New Roman"/>
+              </w:rPr>
+            </w:pPr>
+            <w:r>
+              <w:rPr>
+                <w:rFonts w:ascii="Times New Roman" w:hAnsi="Times New Roman" w:cs="Times New Roman"/>
+              </w:rPr>
+              <w:t>Бронирование исключительно столиков в ресторанах и кафе</w:t>
+            </w:r>
+          </w:p>
+        </w:tc>
+        <w:tc>
+          <w:tcPr>
+            <w:tcW w:w="1644" w:type="dxa"/>
+          </w:tcPr>
+          <w:p>
+            <w:pPr>
+              <w:pStyle w:val="a7"/>
+              <w:ind w:left="0"/>
+              <w:jc w:val="both"/>
+              <w:rPr>
+                <w:rFonts w:ascii="Times New Roman" w:hAnsi="Times New Roman" w:cs="Times New Roman"/>
+              </w:rPr>
+            </w:pPr>
+            <w:r>
+              <w:rPr>
+                <w:rFonts w:ascii="Times New Roman" w:hAnsi="Times New Roman" w:cs="Times New Roman"/>
+              </w:rPr>
+              <w:t>Отсутствует</w:t>
+            </w:r>
+          </w:p>
+        </w:tc>
+        <w:tc>
+          <w:tcPr>
+            <w:tcW w:w="1488" w:type="dxa"/>
+          </w:tcPr>
+          <w:p>
+            <w:pPr>
+              <w:pStyle w:val="a7"/>
+              <w:ind w:left="0"/>
+              <w:jc w:val="both"/>
+              <w:rPr>
+                <w:rFonts w:ascii="Times New Roman" w:hAnsi="Times New Roman" w:cs="Times New Roman"/>
+              </w:rPr>
+            </w:pPr>
+            <w:r>
+              <w:rPr>
+                <w:rFonts w:ascii="Times New Roman" w:hAnsi="Times New Roman" w:cs="Times New Roman"/>
+              </w:rPr>
+              <w:t>Авторизация, история бронирований</w:t>
+            </w:r>
+          </w:p>
+        </w:tc>
+        <w:tc>
+          <w:tcPr>
+            <w:tcW w:w="1625" w:type="dxa"/>
+          </w:tcPr>
+          <w:p>
+            <w:pPr>
+              <w:pStyle w:val="a7"/>
+              <w:ind w:left="0"/>
+              <w:jc w:val="both"/>
+              <w:rPr>
+                <w:rFonts w:ascii="Times New Roman" w:hAnsi="Times New Roman" w:cs="Times New Roman"/>
+              </w:rPr>
+            </w:pPr>
+            <w:r>
+              <w:rPr>
+                <w:rFonts w:ascii="Times New Roman" w:hAnsi="Times New Roman" w:cs="Times New Roman"/>
+              </w:rPr>
+              <w:t>Стандартное приложение для бронирования</w:t>
+            </w:r>
+          </w:p>
+        </w:tc>
+      </w:tr>
+      <w:tr>
+        <w:tc>
+          <w:tcPr>
+            <w:tcW w:w="418" w:type="dxa"/>
+          </w:tcPr>
+          <w:p>
+            <w:pPr>
+              <w:pStyle w:val="a7"/>
+              <w:ind w:left="0"/>
+              <w:jc w:val="both"/>
+              <w:rPr>
+                <w:rFonts w:ascii="Times New Roman" w:hAnsi="Times New Roman" w:cs="Times New Roman"/>
+              </w:rPr>
+            </w:pPr>
+            <w:r>
+              <w:rPr>
+                <w:rFonts w:ascii="Times New Roman" w:hAnsi="Times New Roman" w:cs="Times New Roman"/>
+              </w:rPr>
+              <w:t>4</w:t>
+            </w:r>
+          </w:p>
+        </w:tc>
+        <w:tc>
+          <w:tcPr>
+            <w:tcW w:w="1255" w:type="dxa"/>
+          </w:tcPr>
+          <w:p>
+            <w:pPr>
+              <w:jc w:val="both"/>
+              <w:rPr>
+                <w:rFonts w:ascii="Times New Roman" w:hAnsi="Times New Roman" w:cs="Times New Roman"/>
+              </w:rPr>
+            </w:pPr>
+            <w:r>
+              <w:rPr>
+                <w:rFonts w:ascii="Times New Roman" w:hAnsi="Times New Roman" w:cs="Times New Roman"/>
+                <w:lang w:val="en-US"/>
+              </w:rPr>
+              <w:t>Yelp</w:t>
+            </w:r>
+          </w:p>
+          <w:p>
+            <w:pPr>
+              <w:pStyle w:val="a7"/>
+              <w:ind w:left="0"/>
+              <w:jc w:val="both"/>
+              <w:rPr>
+                <w:rFonts w:ascii="Times New Roman" w:hAnsi="Times New Roman" w:cs="Times New Roman"/>
+              </w:rPr>
+            </w:pPr>
+          </w:p>
+        </w:tc>
+        <w:tc>
+          <w:tcPr>
+            <w:tcW w:w="1579" w:type="dxa"/>
+          </w:tcPr>
+          <w:p>
+            <w:pPr>
+              <w:pStyle w:val="a7"/>
+              <w:ind w:left="0"/>
+              <w:jc w:val="both"/>
+              <w:rPr>
+                <w:rFonts w:ascii="Times New Roman" w:hAnsi="Times New Roman" w:cs="Times New Roman"/>
+              </w:rPr>
+            </w:pPr>
+            <w:r>
+              <w:rPr>
+                <w:rFonts w:ascii="Times New Roman" w:hAnsi="Times New Roman" w:cs="Times New Roman"/>
+              </w:rPr>
+              <w:t>Фильтры по категориям, поиск по названию или описанию, поиск на карте</w:t>
+            </w:r>
+          </w:p>
+        </w:tc>
+        <w:tc>
+          <w:tcPr>
+            <w:tcW w:w="1767" w:type="dxa"/>
+          </w:tcPr>
+          <w:p>
+            <w:pPr>
+              <w:pStyle w:val="a7"/>
+              <w:ind w:left="0"/>
+              <w:jc w:val="both"/>
+              <w:rPr>
+                <w:rFonts w:ascii="Times New Roman" w:hAnsi="Times New Roman" w:cs="Times New Roman"/>
+              </w:rPr>
+            </w:pPr>
+            <w:r>
+              <w:rPr>
+                <w:rFonts w:ascii="Times New Roman" w:hAnsi="Times New Roman" w:cs="Times New Roman"/>
+              </w:rPr>
+              <w:t>Б</w:t>
+            </w:r>
+            <w:r>
+              <w:rPr>
+                <w:rFonts w:ascii="Times New Roman" w:hAnsi="Times New Roman" w:cs="Times New Roman"/>
+              </w:rPr>
+              <w:t>ронирование исключительно столиков в ресторанах и кафе</w:t>
+            </w:r>
+          </w:p>
+        </w:tc>
+        <w:tc>
+          <w:tcPr>
+            <w:tcW w:w="1644" w:type="dxa"/>
+          </w:tcPr>
+          <w:p>
+            <w:pPr>
+              <w:pStyle w:val="a7"/>
+              <w:ind w:left="0"/>
+              <w:jc w:val="both"/>
+              <w:rPr>
+                <w:rFonts w:ascii="Times New Roman" w:hAnsi="Times New Roman" w:cs="Times New Roman"/>
+              </w:rPr>
+            </w:pPr>
+            <w:r>
+              <w:rPr>
+                <w:rFonts w:ascii="Times New Roman" w:hAnsi="Times New Roman" w:cs="Times New Roman"/>
+              </w:rPr>
+              <w:t>Отсутствует</w:t>
+            </w:r>
+          </w:p>
+        </w:tc>
+        <w:tc>
+          <w:tcPr>
+            <w:tcW w:w="1488" w:type="dxa"/>
+          </w:tcPr>
+          <w:p>
+            <w:pPr>
+              <w:pStyle w:val="a7"/>
+              <w:ind w:left="0"/>
+              <w:jc w:val="both"/>
+              <w:rPr>
+                <w:rFonts w:ascii="Times New Roman" w:hAnsi="Times New Roman" w:cs="Times New Roman"/>
+              </w:rPr>
+            </w:pPr>
+            <w:r>
+              <w:rPr>
+                <w:rFonts w:ascii="Times New Roman" w:hAnsi="Times New Roman" w:cs="Times New Roman"/>
+              </w:rPr>
+              <w:t>Авторизация, история бронирований</w:t>
+            </w:r>
+          </w:p>
+        </w:tc>
+        <w:tc>
+          <w:tcPr>
+            <w:tcW w:w="1625" w:type="dxa"/>
+          </w:tcPr>
+          <w:p>
+            <w:pPr>
+              <w:pStyle w:val="a7"/>
+              <w:ind w:left="0"/>
+              <w:jc w:val="both"/>
+              <w:rPr>
+                <w:rFonts w:ascii="Times New Roman" w:hAnsi="Times New Roman" w:cs="Times New Roman"/>
+              </w:rPr>
+            </w:pPr>
+            <w:r>
+              <w:rPr>
+                <w:rFonts w:ascii="Times New Roman" w:hAnsi="Times New Roman" w:cs="Times New Roman"/>
+              </w:rPr>
+              <w:t>Стандартное приложение для бронирования</w:t>
+            </w:r>
+          </w:p>
+        </w:tc>
+      </w:tr>
+    </w:tbl>
+    <w:p>
+      <w:pPr>
+        <w:pStyle w:val="a7"/>
+        <w:spacing w:after="0" w:line="360" w:lineRule="auto"/>
+        <w:ind w:left="0" w:firstLine="709"/>
+        <w:jc w:val="both"/>
+        <w:rPr>
+          <w:rFonts w:ascii="Times New Roman" w:hAnsi="Times New Roman" w:cs="Times New Roman"/>
+          <w:sz w:val="28"/>
+          <w:szCs w:val="28"/>
+        </w:rPr>
+      </w:pPr>
+      <w:r>
+        <w:rPr>
+          <w:rFonts w:ascii="Times New Roman" w:hAnsi="Times New Roman" w:cs="Times New Roman"/>
+          <w:sz w:val="28"/>
+          <w:szCs w:val="28"/>
+        </w:rPr>
+        <w:t>Ценность для пользователя</w:t>
+      </w:r>
+      <w:r>
+        <w:rPr>
+          <w:rFonts w:ascii="Times New Roman" w:hAnsi="Times New Roman" w:cs="Times New Roman"/>
+          <w:sz w:val="28"/>
+          <w:szCs w:val="28"/>
+        </w:rPr>
+        <w:t>:</w:t>
+      </w:r>
+    </w:p>
+    <w:p>
+      <w:pPr>
+        <w:pStyle w:val="a7"/>
+        <w:spacing w:after="0" w:line="360" w:lineRule="auto"/>
+        <w:ind w:left="0" w:firstLine="709"/>
+        <w:jc w:val="both"/>
+        <w:rPr>
+          <w:rFonts w:ascii="Times New Roman" w:hAnsi="Times New Roman" w:cs="Times New Roman"/>
+          <w:sz w:val="28"/>
+          <w:szCs w:val="28"/>
+        </w:rPr>
+      </w:pPr>
+      <w:r>
+        <w:rPr>
+          <w:rFonts w:ascii="Times New Roman" w:hAnsi="Times New Roman" w:cs="Times New Roman"/>
+          <w:sz w:val="28"/>
+          <w:szCs w:val="28"/>
+        </w:rPr>
+        <w:lastRenderedPageBreak/>
+        <w:t xml:space="preserve">Данное приложение разрабатывается не просто как классический сервис для бронирования, а должно помочь максимально персонализировать поиск и подбор заведений по настроению. А фича с воспоминаниями делает </w:t>
+      </w:r>
+      <w:r>
+        <w:rPr>
+          <w:rFonts w:ascii="Times New Roman" w:hAnsi="Times New Roman" w:cs="Times New Roman"/>
+          <w:sz w:val="28"/>
+          <w:szCs w:val="28"/>
+        </w:rPr>
+        <w:t xml:space="preserve">приложение не просто поисковиком, а образует полный пользовательский сценарий – от появления идеи о </w:t>
+      </w:r>
+      <w:r>
+        <w:rPr>
+          <w:rFonts w:ascii="Times New Roman" w:hAnsi="Times New Roman" w:cs="Times New Roman"/>
+          <w:sz w:val="28"/>
+          <w:szCs w:val="28"/>
+        </w:rPr>
+        <w:t>том,</w:t>
+      </w:r>
+      <w:r>
+        <w:rPr>
+          <w:rFonts w:ascii="Times New Roman" w:hAnsi="Times New Roman" w:cs="Times New Roman"/>
+          <w:sz w:val="28"/>
+          <w:szCs w:val="28"/>
+        </w:rPr>
+        <w:t xml:space="preserve"> чтобы провести время – до сохранения впечатлений и воспоминаний от события.</w:t>
       </w:r>
     </w:p>
     <w:sectPr>
@@ -167,8 +1516,186 @@
 </file>
 
 <file path=word/numbering.xml><?xml version="1.0" encoding="utf-8"?>
-<w:numbering xmlns:wpc="http://schemas.microsoft.com/office/word/2010/wordprocessingCanvas" xmlns:cx="http://schemas.microsoft.com/office/drawing/2014/chartex" xmlns:cx1="http://schemas.microsoft.com/office/drawing/2015/9/8/chartex" xmlns:cx2="http://schemas.microsoft.com/office/drawing/2015/10/21/chartex" xmlns:cx3="http://schemas.microsoft.com/office/drawing/2016/5/9/chartex" xmlns:cx4="http://schemas.microsoft.com/office/drawing/2016/5/10/chartex" xmlns:cx5="http://schemas.microsoft.com/office/drawing/2016/5/11/chartex" xmlns:cx6="http://schemas.microsoft.com/office/drawing/2016/5/12/chartex" xmlns:cx7="http://schemas.microsoft.com/office/drawing/2016/5/13/chartex" xmlns:cx8="http://schemas.microsoft.com/office/drawing/2016/5/14/chartex" xmlns:mc="http://schemas.openxmlformats.org/markup-compatibility/2006" xmlns:aink="http://schemas.microsoft.com/office/drawing/2016/ink" xmlns:am3d="http://schemas.microsoft.com/office/drawing/2017/model3d" xmlns:o="urn:schemas-microsoft-com:office:office" xmlns:oel="http://schemas.microsoft.com/office/2019/extlst" xmlns:r="http://schemas.openxmlformats.org/officeDocument/2006/relationships" xmlns:m="http://schemas.openxmlformats.org/officeDocument/2006/math" xmlns:v="urn:schemas-microsoft-com:vml" xmlns:wp14="http://schemas.microsoft.com/office/word/2010/wordprocessingDrawing" xmlns:wp="http://schemas.openxmlformats.org/drawingml/2006/wordprocessingDrawing" xmlns:w10="urn:schemas-microsoft-com:office:word" xmlns:w="http://schemas.openxmlformats.org/wordprocessingml/2006/main" xmlns:w14="http://schemas.microsoft.com/office/word/2010/wordml" xmlns:w15="http://schemas.microsoft.com/office/word/2012/wordml" xmlns:w16cex="http://schemas.microsoft.com/office/word/2018/wordml/cex" xmlns:w16cid="http://schemas.microsoft.com/office/word/2016/wordml/cid" xmlns:w16="http://schemas.microsoft.com/office/word/2018/wordml" xmlns:w16du="http://schemas.microsoft.com/office/word/2023/wordml/word16du" xmlns:w16sdtdh="http://schemas.microsoft.com/office/word/2020/wordml/sdtdatahash" xmlns:w16sdtfl="http://schemas.microsoft.com/office/word/2024/wordml/sdtformatlock" xmlns:w16se="http://schemas.microsoft.com/office/word/2015/wordml/symex" xmlns:wpg="http://schemas.microsoft.com/office/word/2010/wordprocessingGroup" xmlns:wpi="http://schemas.microsoft.com/office/word/2010/wordprocessingInk" xmlns:wne="http://schemas.microsoft.com/office/word/2006/wordml" xmlns:wps="http://schemas.microsoft.com/office/word/2010/wordprocessingShape" mc:Ignorable="w14 w15 w16se w16cid w16 w16cex w16sdtdh w16sdtfl w16du wp14">
+<w:numbering xmlns:wpc="http://schemas.microsoft.com/office/word/2010/wordprocessingCanvas" xmlns:cx="http://schemas.microsoft.com/office/drawing/2014/chartex" xmlns:cx1="http://schemas.microsoft.com/office/drawing/2015/9/8/chartex" xmlns:cx2="http://schemas.microsoft.com/office/drawing/2015/10/21/chartex" xmlns:cx3="http://schemas.microsoft.com/office/drawing/2016/5/9/chartex" xmlns:cx4="http://schemas.microsoft.com/office/drawing/2016/5/10/chartex" xmlns:cx5="http://schemas.microsoft.com/office/drawing/2016/5/11/chartex" xmlns:cx6="http://schemas.microsoft.com/office/drawing/2016/5/12/chartex" xmlns:cx7="http://schemas.microsoft.com/office/drawing/2016/5/13/chartex" xmlns:cx8="http://schemas.microsoft.com/office/drawing/2016/5/14/chartex" xmlns:mc="http://schemas.openxmlformats.org/markup-compatibility/2006" xmlns:aink="http://schemas.microsoft.com/office/drawing/2016/ink" xmlns:am3d="http://schemas.microsoft.com/office/drawing/2017/model3d" xmlns:o="urn:schemas-microsoft-com:office:office" xmlns:r="http://schemas.openxmlformats.org/officeDocument/2006/relationships" xmlns:m="http://schemas.openxmlformats.org/officeDocument/2006/math" xmlns:v="urn:schemas-microsoft-com:vml" xmlns:wp14="http://schemas.microsoft.com/office/word/2010/wordprocessingDrawing" xmlns:wp="http://schemas.openxmlformats.org/drawingml/2006/wordprocessingDrawing" xmlns:w10="urn:schemas-microsoft-com:office:word" xmlns:w="http://schemas.openxmlformats.org/wordprocessingml/2006/main" xmlns:w14="http://schemas.microsoft.com/office/word/2010/wordml" xmlns:w15="http://schemas.microsoft.com/office/word/2012/wordml" xmlns:w16cex="http://schemas.microsoft.com/office/word/2018/wordml/cex" xmlns:w16cid="http://schemas.microsoft.com/office/word/2016/wordml/cid" xmlns:w16="http://schemas.microsoft.com/office/word/2018/wordml" xmlns:w16sdtdh="http://schemas.microsoft.com/office/word/2020/wordml/sdtdatahash" xmlns:w16se="http://schemas.microsoft.com/office/word/2015/wordml/symex" xmlns:wpg="http://schemas.microsoft.com/office/word/2010/wordprocessingGroup" xmlns:wpi="http://schemas.microsoft.com/office/word/2010/wordprocessingInk" xmlns:wne="http://schemas.microsoft.com/office/word/2006/wordml" xmlns:wps="http://schemas.microsoft.com/office/word/2010/wordprocessingShape" mc:Ignorable="w14 w15 w16se w16cid w16 w16cex w16sdtdh wp14">
   <w:abstractNum w:abstractNumId="0" w15:restartNumberingAfterBreak="0">
+    <w:nsid w:val="1E485475"/>
+    <w:multiLevelType w:val="hybridMultilevel"/>
+    <w:tmpl w:val="06B4997E"/>
+    <w:lvl w:ilvl="0" w:tplc="FFFFFFFF">
+      <w:start w:val="1"/>
+      <w:numFmt w:val="decimal"/>
+      <w:lvlText w:val="%1."/>
+      <w:lvlJc w:val="left"/>
+      <w:pPr>
+        <w:ind w:left="1069" w:hanging="360"/>
+      </w:pPr>
+      <w:rPr>
+        <w:rFonts w:hint="default"/>
+      </w:rPr>
+    </w:lvl>
+    <w:lvl w:ilvl="1" w:tplc="FFFFFFFF" w:tentative="1">
+      <w:start w:val="1"/>
+      <w:numFmt w:val="lowerLetter"/>
+      <w:lvlText w:val="%2."/>
+      <w:lvlJc w:val="left"/>
+      <w:pPr>
+        <w:ind w:left="1789" w:hanging="360"/>
+      </w:pPr>
+    </w:lvl>
+    <w:lvl w:ilvl="2" w:tplc="FFFFFFFF" w:tentative="1">
+      <w:start w:val="1"/>
+      <w:numFmt w:val="lowerRoman"/>
+      <w:lvlText w:val="%3."/>
+      <w:lvlJc w:val="right"/>
+      <w:pPr>
+        <w:ind w:left="2509" w:hanging="180"/>
+      </w:pPr>
+    </w:lvl>
+    <w:lvl w:ilvl="3" w:tplc="FFFFFFFF" w:tentative="1">
+      <w:start w:val="1"/>
+      <w:numFmt w:val="decimal"/>
+      <w:lvlText w:val="%4."/>
+      <w:lvlJc w:val="left"/>
+      <w:pPr>
+        <w:ind w:left="3229" w:hanging="360"/>
+      </w:pPr>
+    </w:lvl>
+    <w:lvl w:ilvl="4" w:tplc="FFFFFFFF" w:tentative="1">
+      <w:start w:val="1"/>
+      <w:numFmt w:val="lowerLetter"/>
+      <w:lvlText w:val="%5."/>
+      <w:lvlJc w:val="left"/>
+      <w:pPr>
+        <w:ind w:left="3949" w:hanging="360"/>
+      </w:pPr>
+    </w:lvl>
+    <w:lvl w:ilvl="5" w:tplc="FFFFFFFF" w:tentative="1">
+      <w:start w:val="1"/>
+      <w:numFmt w:val="lowerRoman"/>
+      <w:lvlText w:val="%6."/>
+      <w:lvlJc w:val="right"/>
+      <w:pPr>
+        <w:ind w:left="4669" w:hanging="180"/>
+      </w:pPr>
+    </w:lvl>
+    <w:lvl w:ilvl="6" w:tplc="FFFFFFFF" w:tentative="1">
+      <w:start w:val="1"/>
+      <w:numFmt w:val="decimal"/>
+      <w:lvlText w:val="%7."/>
+      <w:lvlJc w:val="left"/>
+      <w:pPr>
+        <w:ind w:left="5389" w:hanging="360"/>
+      </w:pPr>
+    </w:lvl>
+    <w:lvl w:ilvl="7" w:tplc="FFFFFFFF" w:tentative="1">
+      <w:start w:val="1"/>
+      <w:numFmt w:val="lowerLetter"/>
+      <w:lvlText w:val="%8."/>
+      <w:lvlJc w:val="left"/>
+      <w:pPr>
+        <w:ind w:left="6109" w:hanging="360"/>
+      </w:pPr>
+    </w:lvl>
+    <w:lvl w:ilvl="8" w:tplc="FFFFFFFF" w:tentative="1">
+      <w:start w:val="1"/>
+      <w:numFmt w:val="lowerRoman"/>
+      <w:lvlText w:val="%9."/>
+      <w:lvlJc w:val="right"/>
+      <w:pPr>
+        <w:ind w:left="6829" w:hanging="180"/>
+      </w:pPr>
+    </w:lvl>
+  </w:abstractNum>
+  <w:abstractNum w:abstractNumId="1" w15:restartNumberingAfterBreak="0">
+    <w:nsid w:val="364A79A3"/>
+    <w:multiLevelType w:val="hybridMultilevel"/>
+    <w:tmpl w:val="06B4997E"/>
+    <w:lvl w:ilvl="0" w:tplc="FC0AD17C">
+      <w:start w:val="1"/>
+      <w:numFmt w:val="decimal"/>
+      <w:lvlText w:val="%1."/>
+      <w:lvlJc w:val="left"/>
+      <w:pPr>
+        <w:ind w:left="1069" w:hanging="360"/>
+      </w:pPr>
+      <w:rPr>
+        <w:rFonts w:hint="default"/>
+      </w:rPr>
+    </w:lvl>
+    <w:lvl w:ilvl="1" w:tplc="04190019" w:tentative="1">
+      <w:start w:val="1"/>
+      <w:numFmt w:val="lowerLetter"/>
+      <w:lvlText w:val="%2."/>
+      <w:lvlJc w:val="left"/>
+      <w:pPr>
+        <w:ind w:left="1789" w:hanging="360"/>
+      </w:pPr>
+    </w:lvl>
+    <w:lvl w:ilvl="2" w:tplc="0419001B" w:tentative="1">
+      <w:start w:val="1"/>
+      <w:numFmt w:val="lowerRoman"/>
+      <w:lvlText w:val="%3."/>
+      <w:lvlJc w:val="right"/>
+      <w:pPr>
+        <w:ind w:left="2509" w:hanging="180"/>
+      </w:pPr>
+    </w:lvl>
+    <w:lvl w:ilvl="3" w:tplc="0419000F" w:tentative="1">
+      <w:start w:val="1"/>
+      <w:numFmt w:val="decimal"/>
+      <w:lvlText w:val="%4."/>
+      <w:lvlJc w:val="left"/>
+      <w:pPr>
+        <w:ind w:left="3229" w:hanging="360"/>
+      </w:pPr>
+    </w:lvl>
+    <w:lvl w:ilvl="4" w:tplc="04190019" w:tentative="1">
+      <w:start w:val="1"/>
+      <w:numFmt w:val="lowerLetter"/>
+      <w:lvlText w:val="%5."/>
+      <w:lvlJc w:val="left"/>
+      <w:pPr>
+        <w:ind w:left="3949" w:hanging="360"/>
+      </w:pPr>
+    </w:lvl>
+    <w:lvl w:ilvl="5" w:tplc="0419001B" w:tentative="1">
+      <w:start w:val="1"/>
+      <w:numFmt w:val="lowerRoman"/>
+      <w:lvlText w:val="%6."/>
+      <w:lvlJc w:val="right"/>
+      <w:pPr>
+        <w:ind w:left="4669" w:hanging="180"/>
+      </w:pPr>
+    </w:lvl>
+    <w:lvl w:ilvl="6" w:tplc="0419000F" w:tentative="1">
+      <w:start w:val="1"/>
+      <w:numFmt w:val="decimal"/>
+      <w:lvlText w:val="%7."/>
+      <w:lvlJc w:val="left"/>
+      <w:pPr>
+        <w:ind w:left="5389" w:hanging="360"/>
+      </w:pPr>
+    </w:lvl>
+    <w:lvl w:ilvl="7" w:tplc="04190019" w:tentative="1">
+      <w:start w:val="1"/>
+      <w:numFmt w:val="lowerLetter"/>
+      <w:lvlText w:val="%8."/>
+      <w:lvlJc w:val="left"/>
+      <w:pPr>
+        <w:ind w:left="6109" w:hanging="360"/>
+      </w:pPr>
+    </w:lvl>
+    <w:lvl w:ilvl="8" w:tplc="0419001B" w:tentative="1">
+      <w:start w:val="1"/>
+      <w:numFmt w:val="lowerRoman"/>
+      <w:lvlText w:val="%9."/>
+      <w:lvlJc w:val="right"/>
+      <w:pPr>
+        <w:ind w:left="6829" w:hanging="180"/>
+      </w:pPr>
+    </w:lvl>
+  </w:abstractNum>
+  <w:abstractNum w:abstractNumId="2" w15:restartNumberingAfterBreak="0">
     <w:nsid w:val="67F32D16"/>
     <w:multiLevelType w:val="hybridMultilevel"/>
     <w:tmpl w:val="19EA8B7E"/>
@@ -280,14 +1807,112 @@
       </w:rPr>
     </w:lvl>
   </w:abstractNum>
-  <w:num w:numId="1" w16cid:durableId="96414264">
+  <w:abstractNum w:abstractNumId="3" w15:restartNumberingAfterBreak="0">
+    <w:nsid w:val="6BF31DE3"/>
+    <w:multiLevelType w:val="hybridMultilevel"/>
+    <w:tmpl w:val="06B4997E"/>
+    <w:lvl w:ilvl="0" w:tplc="FFFFFFFF">
+      <w:start w:val="1"/>
+      <w:numFmt w:val="decimal"/>
+      <w:lvlText w:val="%1."/>
+      <w:lvlJc w:val="left"/>
+      <w:pPr>
+        <w:ind w:left="1069" w:hanging="360"/>
+      </w:pPr>
+      <w:rPr>
+        <w:rFonts w:hint="default"/>
+      </w:rPr>
+    </w:lvl>
+    <w:lvl w:ilvl="1" w:tplc="FFFFFFFF" w:tentative="1">
+      <w:start w:val="1"/>
+      <w:numFmt w:val="lowerLetter"/>
+      <w:lvlText w:val="%2."/>
+      <w:lvlJc w:val="left"/>
+      <w:pPr>
+        <w:ind w:left="1789" w:hanging="360"/>
+      </w:pPr>
+    </w:lvl>
+    <w:lvl w:ilvl="2" w:tplc="FFFFFFFF" w:tentative="1">
+      <w:start w:val="1"/>
+      <w:numFmt w:val="lowerRoman"/>
+      <w:lvlText w:val="%3."/>
+      <w:lvlJc w:val="right"/>
+      <w:pPr>
+        <w:ind w:left="2509" w:hanging="180"/>
+      </w:pPr>
+    </w:lvl>
+    <w:lvl w:ilvl="3" w:tplc="FFFFFFFF" w:tentative="1">
+      <w:start w:val="1"/>
+      <w:numFmt w:val="decimal"/>
+      <w:lvlText w:val="%4."/>
+      <w:lvlJc w:val="left"/>
+      <w:pPr>
+        <w:ind w:left="3229" w:hanging="360"/>
+      </w:pPr>
+    </w:lvl>
+    <w:lvl w:ilvl="4" w:tplc="FFFFFFFF" w:tentative="1">
+      <w:start w:val="1"/>
+      <w:numFmt w:val="lowerLetter"/>
+      <w:lvlText w:val="%5."/>
+      <w:lvlJc w:val="left"/>
+      <w:pPr>
+        <w:ind w:left="3949" w:hanging="360"/>
+      </w:pPr>
+    </w:lvl>
+    <w:lvl w:ilvl="5" w:tplc="FFFFFFFF" w:tentative="1">
+      <w:start w:val="1"/>
+      <w:numFmt w:val="lowerRoman"/>
+      <w:lvlText w:val="%6."/>
+      <w:lvlJc w:val="right"/>
+      <w:pPr>
+        <w:ind w:left="4669" w:hanging="180"/>
+      </w:pPr>
+    </w:lvl>
+    <w:lvl w:ilvl="6" w:tplc="FFFFFFFF" w:tentative="1">
+      <w:start w:val="1"/>
+      <w:numFmt w:val="decimal"/>
+      <w:lvlText w:val="%7."/>
+      <w:lvlJc w:val="left"/>
+      <w:pPr>
+        <w:ind w:left="5389" w:hanging="360"/>
+      </w:pPr>
+    </w:lvl>
+    <w:lvl w:ilvl="7" w:tplc="FFFFFFFF" w:tentative="1">
+      <w:start w:val="1"/>
+      <w:numFmt w:val="lowerLetter"/>
+      <w:lvlText w:val="%8."/>
+      <w:lvlJc w:val="left"/>
+      <w:pPr>
+        <w:ind w:left="6109" w:hanging="360"/>
+      </w:pPr>
+    </w:lvl>
+    <w:lvl w:ilvl="8" w:tplc="FFFFFFFF" w:tentative="1">
+      <w:start w:val="1"/>
+      <w:numFmt w:val="lowerRoman"/>
+      <w:lvlText w:val="%9."/>
+      <w:lvlJc w:val="right"/>
+      <w:pPr>
+        <w:ind w:left="6829" w:hanging="180"/>
+      </w:pPr>
+    </w:lvl>
+  </w:abstractNum>
+  <w:num w:numId="1">
+    <w:abstractNumId w:val="2"/>
+  </w:num>
+  <w:num w:numId="2">
+    <w:abstractNumId w:val="1"/>
+  </w:num>
+  <w:num w:numId="3">
+    <w:abstractNumId w:val="3"/>
+  </w:num>
+  <w:num w:numId="4">
     <w:abstractNumId w:val="0"/>
   </w:num>
 </w:numbering>
 </file>
 
 <file path=word/styles.xml><?xml version="1.0" encoding="utf-8"?>
-<w:styles xmlns:mc="http://schemas.openxmlformats.org/markup-compatibility/2006" xmlns:r="http://schemas.openxmlformats.org/officeDocument/2006/relationships" xmlns:w="http://schemas.openxmlformats.org/wordprocessingml/2006/main" xmlns:w14="http://schemas.microsoft.com/office/word/2010/wordml" xmlns:w15="http://schemas.microsoft.com/office/word/2012/wordml" xmlns:w16cex="http://schemas.microsoft.com/office/word/2018/wordml/cex" xmlns:w16cid="http://schemas.microsoft.com/office/word/2016/wordml/cid" xmlns:w16="http://schemas.microsoft.com/office/word/2018/wordml" xmlns:w16du="http://schemas.microsoft.com/office/word/2023/wordml/word16du" xmlns:w16sdtdh="http://schemas.microsoft.com/office/word/2020/wordml/sdtdatahash" xmlns:w16sdtfl="http://schemas.microsoft.com/office/word/2024/wordml/sdtformatlock" xmlns:w16se="http://schemas.microsoft.com/office/word/2015/wordml/symex" mc:Ignorable="w14 w15 w16se w16cid w16 w16cex w16sdtdh w16sdtfl w16du">
+<w:styles xmlns:mc="http://schemas.openxmlformats.org/markup-compatibility/2006" xmlns:r="http://schemas.openxmlformats.org/officeDocument/2006/relationships" xmlns:w="http://schemas.openxmlformats.org/wordprocessingml/2006/main" xmlns:w14="http://schemas.microsoft.com/office/word/2010/wordml" xmlns:w15="http://schemas.microsoft.com/office/word/2012/wordml" xmlns:w16cex="http://schemas.microsoft.com/office/word/2018/wordml/cex" xmlns:w16cid="http://schemas.microsoft.com/office/word/2016/wordml/cid" xmlns:w16="http://schemas.microsoft.com/office/word/2018/wordml" xmlns:w16sdtdh="http://schemas.microsoft.com/office/word/2020/wordml/sdtdatahash" xmlns:w16se="http://schemas.microsoft.com/office/word/2015/wordml/symex" mc:Ignorable="w14 w15 w16se w16cid w16 w16cex w16sdtdh">
   <w:docDefaults>
     <w:rPrDefault>
       <w:rPr>
@@ -1203,6 +2828,25 @@
       <w:spacing w:val="5"/>
     </w:rPr>
   </w:style>
+  <w:style w:type="table" w:styleId="ac">
+    <w:name w:val="Table Grid"/>
+    <w:basedOn w:val="a1"/>
+    <w:uiPriority w:val="39"/>
+    <w:rsid w:val="00411A2C"/>
+    <w:pPr>
+      <w:spacing w:after="0" w:line="240" w:lineRule="auto"/>
+    </w:pPr>
+    <w:tblPr>
+      <w:tblBorders>
+        <w:top w:val="single" w:sz="4" w:space="0" w:color="auto"/>
+        <w:left w:val="single" w:sz="4" w:space="0" w:color="auto"/>
+        <w:bottom w:val="single" w:sz="4" w:space="0" w:color="auto"/>
+        <w:right w:val="single" w:sz="4" w:space="0" w:color="auto"/>
+        <w:insideH w:val="single" w:sz="4" w:space="0" w:color="auto"/>
+        <w:insideV w:val="single" w:sz="4" w:space="0" w:color="auto"/>
+      </w:tblBorders>
+    </w:tblPr>
+  </w:style>
 </w:styles>
 </file>
 

</xml_diff>